<commit_message>
Fix document formatting issues found during Drive upload
ドライブへ格納する過程で見つかった書式の不具合を修正した。

- 行をまたぐ強調記法がHTML/Wordに素通りしていた箇所（協賛依頼書の宛名）
- 表セル内の <br> がエスケープされて表示されていた箇所（企画書・しおり）
- 引用ブロックの空行が「>」として出力されていた箇所（動画台本）

内容面の修正:
- 協賛金の目標額を400,000円（25,000円・40名で均衡する水準）に改め、
  700,000円は上積み目標として超過分の充当先を明記
- 企画書の後援申請先に豊明市（事務局所在地）を追加

Markdown・HTML・Word の変換スクリプトを直したうえで13点すべて再生成し、
Wordファイルが開けることを確認済み。

Co-Authored-By: Claude Opus 5 <noreply@anthropic.com>
Claude-Session: https://claude.ai/code/session_013uHVZ6mctd3Nf71YB6Fi8j
</commit_message>
<xml_diff>
--- a/build/word/00-企画書.docx
+++ b/build/word/00-企画書.docx
@@ -485,7 +485,7 @@
                 <w:color w:val="1F2933"/>
                 <w:sz w:val="19"/>
               </w:rPr>
-              <w:t>公益財団法人修養団（SYD）伊勢青少年研修センター&lt;br&gt;三重県伊勢市宇治今在家町153</w:t>
+              <w:t>公益財団法人修養団（SYD）伊勢青少年研修センター、三重県伊勢市宇治今在家町153</w:t>
             </w:r>
           </w:p>
         </w:tc>
@@ -993,7 +993,7 @@
                 <w:color w:val="1F2933"/>
                 <w:sz w:val="19"/>
               </w:rPr>
-              <w:t>公益財団法人修養団（SYD）伊勢青少年研修センター&lt;br&gt;教育再生いばらき</w:t>
+              <w:t>公益財団法人修養団（SYD）伊勢青少年研修センター、教育再生いばらき</w:t>
             </w:r>
           </w:p>
         </w:tc>
@@ -1041,7 +1041,7 @@
                 <w:color w:val="1F2933"/>
                 <w:sz w:val="19"/>
               </w:rPr>
-              <w:t>名古屋市教育委員会／名古屋市／愛知県／伊勢市</w:t>
+              <w:t>名古屋市教育委員会／名古屋市／愛知県／豊明市／伊勢市</w:t>
             </w:r>
           </w:p>
         </w:tc>

</xml_diff>